<commit_message>
docs: update system architecture specifications with Azure Cosmos DB Free Tier details
</commit_message>
<xml_diff>
--- a/KBM_Complete_System_Architecture.docx
+++ b/KBM_Complete_System_Architecture.docx
@@ -3005,12 +3005,12 @@
           <w:rFonts w:ascii="Arial" w:hAnsi="Arial"/>
           <w:color w:val="1E3A8A"/>
         </w:rPr>
-        <w:t>6. Database &amp; Persistence Architecture</w:t>
+        <w:t>6. Database &amp; Persistence Architecture (Azure Cosmos DB Free Tier)</w:t>
       </w:r>
     </w:p>
     <w:p>
       <w:r>
-        <w:t>The KBM platform supports two distinct persistence profiles depending on the deployment lifecycle stage:</w:t>
+        <w:t>The KBM platform utilizes Azure Cosmos DB Free Tier (enableFreeTier: true) providing 1,000 RU/s throughput and 25 GB storage free for the lifetime of the Azure subscription at $0.00/month:</w:t>
       </w:r>
     </w:p>
     <w:tbl>
@@ -3021,14 +3021,15 @@
         <w:tblLook w:firstColumn="1" w:firstRow="1" w:lastColumn="0" w:lastRow="0" w:noHBand="0" w:noVBand="1" w:val="04A0"/>
       </w:tblPr>
       <w:tblGrid>
-        <w:gridCol w:w="3120"/>
-        <w:gridCol w:w="3120"/>
-        <w:gridCol w:w="3120"/>
+        <w:gridCol w:w="2340"/>
+        <w:gridCol w:w="2340"/>
+        <w:gridCol w:w="2340"/>
+        <w:gridCol w:w="2340"/>
       </w:tblGrid>
       <w:tr>
         <w:tc>
           <w:tcPr>
-            <w:tcW w:type="dxa" w:w="2592"/>
+            <w:tcW w:type="dxa" w:w="2160"/>
             <w:shd w:fill="1E3A8A"/>
             <w:tcMar>
               <w:top w:w="140" w:type="dxa"/>
@@ -3048,7 +3049,33 @@
                 <w:color w:val="FFFFFF"/>
                 <w:sz w:val="20"/>
               </w:rPr>
-              <w:t>Feature Dimension</w:t>
+              <w:t>Cosmos DB Container</w:t>
+            </w:r>
+          </w:p>
+        </w:tc>
+        <w:tc>
+          <w:tcPr>
+            <w:tcW w:type="dxa" w:w="1872"/>
+            <w:shd w:fill="1E3A8A"/>
+            <w:tcMar>
+              <w:top w:w="140" w:type="dxa"/>
+              <w:bottom w:w="140" w:type="dxa"/>
+              <w:left w:w="160" w:type="dxa"/>
+              <w:right w:w="160" w:type="dxa"/>
+            </w:tcMar>
+          </w:tcPr>
+          <w:p>
+            <w:pPr>
+              <w:jc w:val="left"/>
+            </w:pPr>
+            <w:r>
+              <w:rPr>
+                <w:rFonts w:ascii="Calibri" w:hAnsi="Calibri"/>
+                <w:b/>
+                <w:color w:val="FFFFFF"/>
+                <w:sz w:val="20"/>
+              </w:rPr>
+              <w:t>Partition Key</w:t>
             </w:r>
           </w:p>
         </w:tc>
@@ -3074,13 +3101,13 @@
                 <w:color w:val="FFFFFF"/>
                 <w:sz w:val="20"/>
               </w:rPr>
-              <w:t>Zero-Cost Bootstrap Profile ($0/mo)</w:t>
+              <w:t>Data Managed &amp; Stored</w:t>
             </w:r>
           </w:p>
         </w:tc>
         <w:tc>
           <w:tcPr>
-            <w:tcW w:type="dxa" w:w="3456"/>
+            <w:tcW w:type="dxa" w:w="2448"/>
             <w:shd w:fill="1E3A8A"/>
             <w:tcMar>
               <w:top w:w="140" w:type="dxa"/>
@@ -3100,7 +3127,7 @@
                 <w:color w:val="FFFFFF"/>
                 <w:sz w:val="20"/>
               </w:rPr>
-              <w:t>Enterprise Production Profile</w:t>
+              <w:t>Cryptographic / Consistency Model</w:t>
             </w:r>
           </w:p>
         </w:tc>
@@ -3108,7 +3135,7 @@
       <w:tr>
         <w:tc>
           <w:tcPr>
-            <w:tcW w:type="dxa" w:w="2592"/>
+            <w:tcW w:type="dxa" w:w="2160"/>
             <w:shd w:fill="FFFFFF"/>
             <w:tcMar>
               <w:top w:w="100" w:type="dxa"/>
@@ -3127,7 +3154,32 @@
                 <w:color w:val="1E293B"/>
                 <w:sz w:val="19"/>
               </w:rPr>
-              <w:t>Primary Database</w:t>
+              <w:t>Tenders</w:t>
+            </w:r>
+          </w:p>
+        </w:tc>
+        <w:tc>
+          <w:tcPr>
+            <w:tcW w:type="dxa" w:w="1872"/>
+            <w:shd w:fill="FFFFFF"/>
+            <w:tcMar>
+              <w:top w:w="100" w:type="dxa"/>
+              <w:bottom w:w="100" w:type="dxa"/>
+              <w:left w:w="140" w:type="dxa"/>
+              <w:right w:w="140" w:type="dxa"/>
+            </w:tcMar>
+          </w:tcPr>
+          <w:p>
+            <w:pPr>
+              <w:jc w:val="left"/>
+            </w:pPr>
+            <w:r>
+              <w:rPr>
+                <w:rFonts w:ascii="Calibri" w:hAnsi="Calibri"/>
+                <w:color w:val="1E293B"/>
+                <w:sz w:val="19"/>
+              </w:rPr>
+              <w:t>/tenantId</w:t>
             </w:r>
           </w:p>
         </w:tc>
@@ -3152,13 +3204,13 @@
                 <w:color w:val="1E293B"/>
                 <w:sz w:val="19"/>
               </w:rPr>
-              <w:t>In-Memory Cryptographic Store + Azure Storage Account</w:t>
+              <w:t>Active tenders, published practices, MoCI commercial activity codes, prices, and eligibility rules.</w:t>
             </w:r>
           </w:p>
         </w:tc>
         <w:tc>
           <w:tcPr>
-            <w:tcW w:type="dxa" w:w="3456"/>
+            <w:tcW w:type="dxa" w:w="2448"/>
             <w:shd w:fill="FFFFFF"/>
             <w:tcMar>
               <w:top w:w="100" w:type="dxa"/>
@@ -3177,7 +3229,7 @@
                 <w:color w:val="1E293B"/>
                 <w:sz w:val="19"/>
               </w:rPr>
-              <w:t>Azure Cosmos DB (NoSQL API, Multi-Region Active)</w:t>
+              <w:t>Session Consistency, Indexed on /activities and /gradeRule</w:t>
             </w:r>
           </w:p>
         </w:tc>
@@ -3185,7 +3237,7 @@
       <w:tr>
         <w:tc>
           <w:tcPr>
-            <w:tcW w:type="dxa" w:w="2592"/>
+            <w:tcW w:type="dxa" w:w="2160"/>
             <w:shd w:fill="F8FAFC"/>
             <w:tcMar>
               <w:top w:w="100" w:type="dxa"/>
@@ -3204,7 +3256,32 @@
                 <w:color w:val="1E293B"/>
                 <w:sz w:val="19"/>
               </w:rPr>
-              <w:t>Partitioning Strategy</w:t>
+              <w:t>Vendors</w:t>
+            </w:r>
+          </w:p>
+        </w:tc>
+        <w:tc>
+          <w:tcPr>
+            <w:tcW w:type="dxa" w:w="1872"/>
+            <w:shd w:fill="F8FAFC"/>
+            <w:tcMar>
+              <w:top w:w="100" w:type="dxa"/>
+              <w:bottom w:w="100" w:type="dxa"/>
+              <w:left w:w="140" w:type="dxa"/>
+              <w:right w:w="140" w:type="dxa"/>
+            </w:tcMar>
+          </w:tcPr>
+          <w:p>
+            <w:pPr>
+              <w:jc w:val="left"/>
+            </w:pPr>
+            <w:r>
+              <w:rPr>
+                <w:rFonts w:ascii="Calibri" w:hAnsi="Calibri"/>
+                <w:color w:val="1E293B"/>
+                <w:sz w:val="19"/>
+              </w:rPr>
+              <w:t>/tenantId</w:t>
             </w:r>
           </w:p>
         </w:tc>
@@ -3229,13 +3306,13 @@
                 <w:color w:val="1E293B"/>
                 <w:sz w:val="19"/>
               </w:rPr>
-              <w:t>Logical Tenant Isolation (tenantId scoping)</w:t>
+              <w:t>Vendor company dossiers, 3-grade classifications, temporary suspensions, and fee exemptions.</w:t>
             </w:r>
           </w:p>
         </w:tc>
         <w:tc>
           <w:tcPr>
-            <w:tcW w:type="dxa" w:w="3456"/>
+            <w:tcW w:type="dxa" w:w="2448"/>
             <w:shd w:fill="F8FAFC"/>
             <w:tcMar>
               <w:top w:w="100" w:type="dxa"/>
@@ -3254,7 +3331,7 @@
                 <w:color w:val="1E293B"/>
                 <w:sz w:val="19"/>
               </w:rPr>
-              <w:t>Physical Partition Key: /tenantId across all collections</w:t>
+              <w:t>Session Consistency, Unique Commercial Registration indexing</w:t>
             </w:r>
           </w:p>
         </w:tc>
@@ -3262,7 +3339,7 @@
       <w:tr>
         <w:tc>
           <w:tcPr>
-            <w:tcW w:type="dxa" w:w="2592"/>
+            <w:tcW w:type="dxa" w:w="2160"/>
             <w:shd w:fill="FFFFFF"/>
             <w:tcMar>
               <w:top w:w="100" w:type="dxa"/>
@@ -3281,7 +3358,32 @@
                 <w:color w:val="1E293B"/>
                 <w:sz w:val="19"/>
               </w:rPr>
-              <w:t>Audit Ledger Storage</w:t>
+              <w:t>Workflows</w:t>
+            </w:r>
+          </w:p>
+        </w:tc>
+        <w:tc>
+          <w:tcPr>
+            <w:tcW w:type="dxa" w:w="1872"/>
+            <w:shd w:fill="FFFFFF"/>
+            <w:tcMar>
+              <w:top w:w="100" w:type="dxa"/>
+              <w:bottom w:w="100" w:type="dxa"/>
+              <w:left w:w="140" w:type="dxa"/>
+              <w:right w:w="140" w:type="dxa"/>
+            </w:tcMar>
+          </w:tcPr>
+          <w:p>
+            <w:pPr>
+              <w:jc w:val="left"/>
+            </w:pPr>
+            <w:r>
+              <w:rPr>
+                <w:rFonts w:ascii="Calibri" w:hAnsi="Calibri"/>
+                <w:color w:val="1E293B"/>
+                <w:sz w:val="19"/>
+              </w:rPr>
+              <w:t>/tenantId</w:t>
             </w:r>
           </w:p>
         </w:tc>
@@ -3306,13 +3408,13 @@
                 <w:color w:val="1E293B"/>
                 <w:sz w:val="19"/>
               </w:rPr>
-              <w:t>Append-only in-memory chain + Azure Table/Blob</w:t>
+              <w:t>35-step statutory approval task instances, SLA trackers, return-for-correction histories.</w:t>
             </w:r>
           </w:p>
         </w:tc>
         <w:tc>
           <w:tcPr>
-            <w:tcW w:type="dxa" w:w="3456"/>
+            <w:tcW w:type="dxa" w:w="2448"/>
             <w:shd w:fill="FFFFFF"/>
             <w:tcMar>
               <w:top w:w="100" w:type="dxa"/>
@@ -3331,7 +3433,7 @@
                 <w:color w:val="1E293B"/>
                 <w:sz w:val="19"/>
               </w:rPr>
-              <w:t>Cosmos DB Dedicated Immutable Event Container</w:t>
+              <w:t>Session Consistency, State machine transition audit links</w:t>
             </w:r>
           </w:p>
         </w:tc>
@@ -3339,7 +3441,7 @@
       <w:tr>
         <w:tc>
           <w:tcPr>
-            <w:tcW w:type="dxa" w:w="2592"/>
+            <w:tcW w:type="dxa" w:w="2160"/>
             <w:shd w:fill="F8FAFC"/>
             <w:tcMar>
               <w:top w:w="100" w:type="dxa"/>
@@ -3358,7 +3460,32 @@
                 <w:color w:val="1E293B"/>
                 <w:sz w:val="19"/>
               </w:rPr>
-              <w:t>Document Storage</w:t>
+              <w:t>AuditEvents</w:t>
+            </w:r>
+          </w:p>
+        </w:tc>
+        <w:tc>
+          <w:tcPr>
+            <w:tcW w:type="dxa" w:w="1872"/>
+            <w:shd w:fill="F8FAFC"/>
+            <w:tcMar>
+              <w:top w:w="100" w:type="dxa"/>
+              <w:bottom w:w="100" w:type="dxa"/>
+              <w:left w:w="140" w:type="dxa"/>
+              <w:right w:w="140" w:type="dxa"/>
+            </w:tcMar>
+          </w:tcPr>
+          <w:p>
+            <w:pPr>
+              <w:jc w:val="left"/>
+            </w:pPr>
+            <w:r>
+              <w:rPr>
+                <w:rFonts w:ascii="Calibri" w:hAnsi="Calibri"/>
+                <w:color w:val="1E293B"/>
+                <w:sz w:val="19"/>
+              </w:rPr>
+              <w:t>/tenantId</w:t>
             </w:r>
           </w:p>
         </w:tc>
@@ -3383,13 +3510,13 @@
                 <w:color w:val="1E293B"/>
                 <w:sz w:val="19"/>
               </w:rPr>
-              <w:t>Local Emulator / Azure Blob Storage LRS</w:t>
+              <w:t>Append-only immutable compliance log linking events with SHA-256 hash chaining (previousHash -&gt; hash).</w:t>
             </w:r>
           </w:p>
         </w:tc>
         <w:tc>
           <w:tcPr>
-            <w:tcW w:type="dxa" w:w="3456"/>
+            <w:tcW w:type="dxa" w:w="2448"/>
             <w:shd w:fill="F8FAFC"/>
             <w:tcMar>
               <w:top w:w="100" w:type="dxa"/>
@@ -3408,238 +3535,59 @@
                 <w:color w:val="1E293B"/>
                 <w:sz w:val="19"/>
               </w:rPr>
-              <w:t>Azure Blob Storage GRS + Customer-Managed Keys (CMK)</w:t>
+              <w:t>Cryptographic Tamper-Evident Ledger, Mathematical verification</w:t>
             </w:r>
           </w:p>
         </w:tc>
       </w:tr>
+    </w:tbl>
+    <w:p/>
+    <w:tbl>
+      <w:tblPr>
+        <w:tblW w:type="auto" w:w="0"/>
+        <w:jc w:val="center"/>
+        <w:tblLayout w:type="fixed"/>
+        <w:tblLook w:firstColumn="1" w:firstRow="1" w:lastColumn="0" w:lastRow="0" w:noHBand="0" w:noVBand="1" w:val="04A0"/>
+      </w:tblPr>
+      <w:tblGrid>
+        <w:gridCol w:w="9360"/>
+      </w:tblGrid>
       <w:tr>
         <w:tc>
           <w:tcPr>
-            <w:tcW w:type="dxa" w:w="2592"/>
-            <w:shd w:fill="FFFFFF"/>
+            <w:tcW w:type="dxa" w:w="9360"/>
+            <w:shd w:fill="EFF6FF"/>
             <w:tcMar>
-              <w:top w:w="100" w:type="dxa"/>
-              <w:bottom w:w="100" w:type="dxa"/>
-              <w:left w:w="140" w:type="dxa"/>
-              <w:right w:w="140" w:type="dxa"/>
+              <w:top w:w="140" w:type="dxa"/>
+              <w:bottom w:w="140" w:type="dxa"/>
+              <w:left w:w="180" w:type="dxa"/>
+              <w:right w:w="180" w:type="dxa"/>
             </w:tcMar>
           </w:tcPr>
           <w:p>
-            <w:pPr>
-              <w:jc w:val="left"/>
-            </w:pPr>
+            <w:r>
+              <w:rPr>
+                <w:rFonts w:ascii="Calibri" w:hAnsi="Calibri"/>
+                <w:b/>
+                <w:color w:val="1E3A8A"/>
+                <w:sz w:val="21"/>
+              </w:rPr>
+              <w:t>📌 Live Azure Cosmos DB Free Tier Provisioning Details</w:t>
+              <w:br/>
+            </w:r>
             <w:r>
               <w:rPr>
                 <w:rFonts w:ascii="Calibri" w:hAnsi="Calibri"/>
                 <w:color w:val="1E293B"/>
                 <w:sz w:val="19"/>
               </w:rPr>
-              <w:t>Throughput &amp; SLA</w:t>
-            </w:r>
-          </w:p>
-        </w:tc>
-        <w:tc>
-          <w:tcPr>
-            <w:tcW w:type="dxa" w:w="3312"/>
-            <w:shd w:fill="FFFFFF"/>
-            <w:tcMar>
-              <w:top w:w="100" w:type="dxa"/>
-              <w:bottom w:w="100" w:type="dxa"/>
-              <w:left w:w="140" w:type="dxa"/>
-              <w:right w:w="140" w:type="dxa"/>
-            </w:tcMar>
-          </w:tcPr>
-          <w:p>
-            <w:pPr>
-              <w:jc w:val="left"/>
-            </w:pPr>
-            <w:r>
-              <w:rPr>
-                <w:rFonts w:ascii="Calibri" w:hAnsi="Calibri"/>
-                <w:color w:val="1E293B"/>
-                <w:sz w:val="19"/>
-              </w:rPr>
-              <w:t>Standard Free Tier Quota</w:t>
-            </w:r>
-          </w:p>
-        </w:tc>
-        <w:tc>
-          <w:tcPr>
-            <w:tcW w:type="dxa" w:w="3456"/>
-            <w:shd w:fill="FFFFFF"/>
-            <w:tcMar>
-              <w:top w:w="100" w:type="dxa"/>
-              <w:bottom w:w="100" w:type="dxa"/>
-              <w:left w:w="140" w:type="dxa"/>
-              <w:right w:w="140" w:type="dxa"/>
-            </w:tcMar>
-          </w:tcPr>
-          <w:p>
-            <w:pPr>
-              <w:jc w:val="left"/>
-            </w:pPr>
-            <w:r>
-              <w:rPr>
-                <w:rFonts w:ascii="Calibri" w:hAnsi="Calibri"/>
-                <w:color w:val="1E293B"/>
-                <w:sz w:val="19"/>
-              </w:rPr>
-              <w:t>Autoscale 400 - 10,000 RU/s with 99.999% Availability SLA</w:t>
-            </w:r>
-          </w:p>
-        </w:tc>
-      </w:tr>
-      <w:tr>
-        <w:tc>
-          <w:tcPr>
-            <w:tcW w:type="dxa" w:w="2592"/>
-            <w:shd w:fill="F8FAFC"/>
-            <w:tcMar>
-              <w:top w:w="100" w:type="dxa"/>
-              <w:bottom w:w="100" w:type="dxa"/>
-              <w:left w:w="140" w:type="dxa"/>
-              <w:right w:w="140" w:type="dxa"/>
-            </w:tcMar>
-          </w:tcPr>
-          <w:p>
-            <w:pPr>
-              <w:jc w:val="left"/>
-            </w:pPr>
-            <w:r>
-              <w:rPr>
-                <w:rFonts w:ascii="Calibri" w:hAnsi="Calibri"/>
-                <w:color w:val="1E293B"/>
-                <w:sz w:val="19"/>
-              </w:rPr>
-              <w:t>Encryption at Rest</w:t>
-            </w:r>
-          </w:p>
-        </w:tc>
-        <w:tc>
-          <w:tcPr>
-            <w:tcW w:type="dxa" w:w="3312"/>
-            <w:shd w:fill="F8FAFC"/>
-            <w:tcMar>
-              <w:top w:w="100" w:type="dxa"/>
-              <w:bottom w:w="100" w:type="dxa"/>
-              <w:left w:w="140" w:type="dxa"/>
-              <w:right w:w="140" w:type="dxa"/>
-            </w:tcMar>
-          </w:tcPr>
-          <w:p>
-            <w:pPr>
-              <w:jc w:val="left"/>
-            </w:pPr>
-            <w:r>
-              <w:rPr>
-                <w:rFonts w:ascii="Calibri" w:hAnsi="Calibri"/>
-                <w:color w:val="1E293B"/>
-                <w:sz w:val="19"/>
-              </w:rPr>
-              <w:t>Standard Microsoft-Managed Keys (SSE)</w:t>
-            </w:r>
-          </w:p>
-        </w:tc>
-        <w:tc>
-          <w:tcPr>
-            <w:tcW w:type="dxa" w:w="3456"/>
-            <w:shd w:fill="F8FAFC"/>
-            <w:tcMar>
-              <w:top w:w="100" w:type="dxa"/>
-              <w:bottom w:w="100" w:type="dxa"/>
-              <w:left w:w="140" w:type="dxa"/>
-              <w:right w:w="140" w:type="dxa"/>
-            </w:tcMar>
-          </w:tcPr>
-          <w:p>
-            <w:pPr>
-              <w:jc w:val="left"/>
-            </w:pPr>
-            <w:r>
-              <w:rPr>
-                <w:rFonts w:ascii="Calibri" w:hAnsi="Calibri"/>
-                <w:color w:val="1E293B"/>
-                <w:sz w:val="19"/>
-              </w:rPr>
-              <w:t>Customer-Managed Keys (CMK) with Azure Key Vault HSM</w:t>
-            </w:r>
-          </w:p>
-        </w:tc>
-      </w:tr>
-      <w:tr>
-        <w:tc>
-          <w:tcPr>
-            <w:tcW w:type="dxa" w:w="2592"/>
-            <w:shd w:fill="FFFFFF"/>
-            <w:tcMar>
-              <w:top w:w="100" w:type="dxa"/>
-              <w:bottom w:w="100" w:type="dxa"/>
-              <w:left w:w="140" w:type="dxa"/>
-              <w:right w:w="140" w:type="dxa"/>
-            </w:tcMar>
-          </w:tcPr>
-          <w:p>
-            <w:pPr>
-              <w:jc w:val="left"/>
-            </w:pPr>
-            <w:r>
-              <w:rPr>
-                <w:rFonts w:ascii="Calibri" w:hAnsi="Calibri"/>
-                <w:color w:val="1E293B"/>
-                <w:sz w:val="19"/>
-              </w:rPr>
-              <w:t>Target Monthly Spend</w:t>
-            </w:r>
-          </w:p>
-        </w:tc>
-        <w:tc>
-          <w:tcPr>
-            <w:tcW w:type="dxa" w:w="3312"/>
-            <w:shd w:fill="FFFFFF"/>
-            <w:tcMar>
-              <w:top w:w="100" w:type="dxa"/>
-              <w:bottom w:w="100" w:type="dxa"/>
-              <w:left w:w="140" w:type="dxa"/>
-              <w:right w:w="140" w:type="dxa"/>
-            </w:tcMar>
-          </w:tcPr>
-          <w:p>
-            <w:pPr>
-              <w:jc w:val="left"/>
-            </w:pPr>
-            <w:r>
-              <w:rPr>
-                <w:rFonts w:ascii="Calibri" w:hAnsi="Calibri"/>
-                <w:color w:val="1E293B"/>
-                <w:sz w:val="19"/>
-              </w:rPr>
-              <w:t>$0.00 / month (Zero Cost Free Tier)</w:t>
-            </w:r>
-          </w:p>
-        </w:tc>
-        <w:tc>
-          <w:tcPr>
-            <w:tcW w:type="dxa" w:w="3456"/>
-            <w:shd w:fill="FFFFFF"/>
-            <w:tcMar>
-              <w:top w:w="100" w:type="dxa"/>
-              <w:bottom w:w="100" w:type="dxa"/>
-              <w:left w:w="140" w:type="dxa"/>
-              <w:right w:w="140" w:type="dxa"/>
-            </w:tcMar>
-          </w:tcPr>
-          <w:p>
-            <w:pPr>
-              <w:jc w:val="left"/>
-            </w:pPr>
-            <w:r>
-              <w:rPr>
-                <w:rFonts w:ascii="Calibri" w:hAnsi="Calibri"/>
-                <w:color w:val="1E293B"/>
-                <w:sz w:val="19"/>
-              </w:rPr>
-              <w:t>$450.00 - $1,200.00 / month (Production Gated)</w:t>
+              <w:t>• Account: kbm-cosmos-uyhsofjy5a23s.documents.azure.com (West Europe)</w:t>
+              <w:br/>
+              <w:t>• Database: kbm-procurement-db (Shared 1,000 RU/s Free Tier)</w:t>
+              <w:br/>
+              <w:t>• Partition Key: /tenantId (Physical &amp; Logical isolation across all 4 containers)</w:t>
+              <w:br/>
+              <w:t>• Cost: $0.00 / month (100% Lifetime Azure Free Tier)</w:t>
             </w:r>
           </w:p>
         </w:tc>

</xml_diff>